<commit_message>
bai tap tuan 5 sql
</commit_message>
<xml_diff>
--- a/baitap_tuan2_tuan3/Bài tập tuần 4.docx
+++ b/baitap_tuan2_tuan3/Bài tập tuần 4.docx
@@ -430,6 +430,30 @@
             </a:graphic>
           </wp:inline>
         </w:drawing>
+      </w:r>
+    </w:p>
+    <w:p>
+      <w:pPr>
+        <w:pStyle w:val="ListParagraph"/>
+        <w:ind w:left="1080"/>
+        <w:rPr>
+          <w:sz w:val="72"/>
+          <w:szCs w:val="72"/>
+        </w:rPr>
+      </w:pPr>
+      <w:r>
+        <w:rPr>
+          <w:sz w:val="72"/>
+          <w:szCs w:val="72"/>
+        </w:rPr>
+        <w:t xml:space="preserve">Link git: </w:t>
+      </w:r>
+      <w:r>
+        <w:rPr>
+          <w:sz w:val="72"/>
+          <w:szCs w:val="72"/>
+        </w:rPr>
+        <w:t>https://github.com/thonocodesiu/J2EE.git</w:t>
       </w:r>
     </w:p>
     <w:sectPr>

</xml_diff>